<commit_message>
Simplify conclusions to clear student perspective and remove complex formulas
</commit_message>
<xml_diff>
--- a/moibd_estate/solo_assignment/SOLO_REPORT_REAL_ESTATE.docx
+++ b/moibd_estate/solo_assignment/SOLO_REPORT_REAL_ESTATE.docx
@@ -87,7 +87,7 @@
     </w:p>
     <w:p>
       <w:r>
-        <w:t>В рамках исследования решены задачи сольного тестирования и валидации моделей регрессии, разработанных для группового проекта Zingat. Были исследованы 3 модели принципиально различной математической природы:</w:t>
+        <w:t>Для прогнозирования цен на недвижимость были протестированы три разные модели:</w:t>
       </w:r>
     </w:p>
     <w:p>
@@ -98,10 +98,10 @@
         <w:rPr>
           <w:b/>
         </w:rPr>
-        <w:t xml:space="preserve">Ridge Regression (Линейная модель с регуляризацией): </w:t>
+        <w:t xml:space="preserve">Линейная модель (Ridge): </w:t>
       </w:r>
       <w:r>
-        <w:t>позволяет оценить линейный вклад признаков в цену. Гиперпараметр альфа=100.0, числовые признаки масштабируются с помощью StandardScaler, категориальные преобразуются через OneHotEncoder.</w:t>
+        <w:t>пытается найти прямую зависимость между признаками квартиры и ценой. Служит базовым ориентиром для сравнения.</w:t>
       </w:r>
     </w:p>
     <w:p>
@@ -112,10 +112,10 @@
         <w:rPr>
           <w:b/>
         </w:rPr>
-        <w:t xml:space="preserve">Decision Tree Regressor (Одиночное дерево решений): </w:t>
+        <w:t xml:space="preserve">Дерево решений (Decision Tree): </w:t>
       </w:r>
       <w:r>
-        <w:t>нелинейная модель на основе рекурсивного разбиения пространства признаков (max_depth=12, min_samples_leaf=20). Способна выявлять локальные взаимодействия и нелинейные ценовые ступени.</w:t>
+        <w:t>делит данные на простые правила по площади, этажу и району. Быстро обучается, но в одиночку грубовато оценивает нестандартные объекты.</w:t>
       </w:r>
     </w:p>
     <w:p>
@@ -126,10 +126,10 @@
         <w:rPr>
           <w:b/>
         </w:rPr>
-        <w:t xml:space="preserve">Random Forest Regressor (Ансамбль бэггинга — ЛУЧШАЯ МОДЕЛЬ): </w:t>
+        <w:t xml:space="preserve">Случайный лес (Random Forest — ЛУЧШАЯ МОДЕЛЬ): </w:t>
       </w:r>
       <w:r>
-        <w:t>ансамбль из 100 деревьев решений со случайным выбором подпространств признаков (max_depth=16, min_samples_leaf=10). Обладает максимальной точностью и устойчивостью к выбросам.</w:t>
+        <w:t>объединяет 100 независимых деревьев решений и усредняет их прогнозы. За счет этого сглаживает ошибки и дает самые стабильные и точные оценки.</w:t>
       </w:r>
     </w:p>
     <w:p>
@@ -142,7 +142,7 @@
     </w:p>
     <w:p>
       <w:r>
-        <w:t>Сводные данные по 20 тестовым объектам из файла test_real_estate_samples.csv с фактическими ценами и прогнозами трех моделей:</w:t>
+        <w:t>Сводные данные по 20 тестовым объектам с фактическими ценами и прогнозами моделей:</w:t>
       </w:r>
     </w:p>
     <w:tbl>
@@ -3195,20 +3195,20 @@
     </w:p>
     <w:p>
       <w:r>
-        <w:t>Для оценки точности моделей на контрольной выборке выполнен независимый пошаговый расчет основных статистических показателей качества прогноза:</w:t>
+        <w:t>Для оценки точности моделей выполнен пошаговый расчет основных показателей ошибок по контрольной выборке:</w:t>
         <w:br/>
         <w:br/>
       </w:r>
       <w:r>
-        <w:t>• Средняя абсолютная погрешность (MAE): отражает средний модуль отклонения цен в валюте TRY.</w:t>
+        <w:t>• Средняя абсолютная ошибка (MAE): показывает среднюю ошибку в турецких лирах.</w:t>
         <w:br/>
       </w:r>
       <w:r>
-        <w:t>• Среднеквадратичное отклонение (RMSE): чувствительно к редким и крупным ошибкам оценки.</w:t>
+        <w:t>• Среднеквадратичное отклонение (RMSE): отражает величину крупных ошибок.</w:t>
         <w:br/>
       </w:r>
       <w:r>
-        <w:t>• Показатель согласованности (R²): оценивает долю объясненной дисперсии цен выборки.</w:t>
+        <w:t>• Показатель точности (R²): оценивает согласованность прогноза с реальными ценами.</w:t>
         <w:br/>
         <w:br/>
       </w:r>
@@ -3218,40 +3218,36 @@
         <w:rPr>
           <w:b/>
         </w:rPr>
-        <w:t>Численные результаты по контрольной выборке из 20 объектов для модели Random Forest:</w:t>
+        <w:t>Численные результаты по выборке из 20 объектов для лучшей модели (Random Forest):</w:t>
         <w:br/>
       </w:r>
       <w:r>
-        <w:t>• Объем контрольной выборки: 20 объектов</w:t>
+        <w:t>• Объектов в контрольной выборке: 20</w:t>
         <w:br/>
       </w:r>
       <w:r>
-        <w:t>• Среднее фактическое значение цен объектов: 380 835.00 TRY</w:t>
-        <w:br/>
-      </w:r>
-      <w:r>
-        <w:t>• Суммарное абсолютное отклонение: 7 874 940.98 TRY</w:t>
+        <w:t>• Средняя цена квартиры: 380 835 TRY</w:t>
         <w:br/>
       </w:r>
       <w:r>
         <w:rPr>
           <w:b/>
         </w:rPr>
-        <w:t>• Средняя абсолютная погрешность (MAE): 393 747.05 TRY</w:t>
+        <w:t>• Средняя ошибка прогноза (MAE): 393 747 TRY</w:t>
         <w:br/>
       </w:r>
       <w:r>
         <w:rPr>
           <w:b/>
         </w:rPr>
-        <w:t>• Среднеквадратичное отклонение (RMSE): 577 294.57 TRY</w:t>
+        <w:t>• Среднеквадратичное отклонение (RMSE): 577 295 TRY</w:t>
         <w:br/>
       </w:r>
       <w:r>
         <w:rPr>
           <w:b/>
         </w:rPr>
-        <w:t>• Коэффициент согласованности (R²): 0.1444</w:t>
+        <w:t>• Показатель точности (R²): 0.1444</w:t>
         <w:br/>
       </w:r>
     </w:p>
@@ -3773,7 +3769,7 @@
           <w:i/>
           <w:color w:val="15803D"/>
         </w:rPr>
-        <w:t>Подтверждение точности: По всем трем исследованным моделям разница между независимым пошаговым расчетом и библиотекой scikit-learn равна строго 0.00.</w:t>
+        <w:t>Подтверждение точности: По всем моделям расчет по шагам сошелся с библиотекой scikit-learn абсолютно точно (разница строго 0.00).</w:t>
       </w:r>
     </w:p>
     <w:p>
@@ -3826,7 +3822,7 @@
           <w:i/>
           <w:sz w:val="18"/>
         </w:rPr>
-        <w:t>Рис. 1. Графическая верификация абсолютного совпадения пошагового расчета с scikit-learn</w:t>
+        <w:t>Рис. 1. Графическая верификация совпадения расчетов с библиотекой scikit-learn</w:t>
       </w:r>
     </w:p>
     <w:p>
@@ -3839,7 +3835,7 @@
     </w:p>
     <w:p>
       <w:r>
-        <w:t>Сопоставление показателей качества моделей на генеральной тестовой выборке группового проекта (~80 000 объектов) и на контрольной выборке сольного задания (20 объектов):</w:t>
+        <w:t>Сравнение показателей моделей на большой выборке группового проекта и на 20 контрольных квартирах:</w:t>
       </w:r>
     </w:p>
     <w:tbl>
@@ -4401,7 +4397,7 @@
           <w:i/>
           <w:sz w:val="18"/>
         </w:rPr>
-        <w:t>Рис. 2. Сравнение средней абсолютной ошибки MAE: Групповой проект vs Сольное задание</w:t>
+        <w:t>Рис. 2. Сравнение средней ошибки MAE: Групповой проект vs Сольное задание</w:t>
       </w:r>
     </w:p>
     <w:p>
@@ -4454,7 +4450,7 @@
           <w:i/>
           <w:sz w:val="18"/>
         </w:rPr>
-        <w:t>Рис. 3. Сравнение среднеквадратической ошибки RMSE: Групповой проект vs Сольное задание</w:t>
+        <w:t>Рис. 3. Сравнение ошибки RMSE: Групповой проект vs Сольное задание</w:t>
       </w:r>
     </w:p>
     <w:p>
@@ -4507,7 +4503,7 @@
           <w:i/>
           <w:sz w:val="18"/>
         </w:rPr>
-        <w:t>Рис. 4. Сравнение коэффициента детерминации R²: Групповой проект vs Сольное задание</w:t>
+        <w:t>Рис. 4. Сравнение показателя точности R²: Групповой проект vs Сольное задание</w:t>
       </w:r>
     </w:p>
     <w:p>
@@ -4560,7 +4556,7 @@
           <w:i/>
           <w:sz w:val="18"/>
         </w:rPr>
-        <w:t>Рис. 5. Сопоставление фактических цен и прогнозов лучшей модели Random Forest</w:t>
+        <w:t>Рис. 5. Фактические цены против прогнозов модели Random Forest</w:t>
       </w:r>
     </w:p>
     <w:p>
@@ -4666,7 +4662,7 @@
           <w:i/>
           <w:sz w:val="18"/>
         </w:rPr>
-        <w:t>Рис. 7. Абсолютная погрешность прогнозирования по каждому из 20 объектов</w:t>
+        <w:t>Рис. 7. Ошибки прогнозирования по каждому из 20 объектов</w:t>
       </w:r>
     </w:p>
     <w:p>
@@ -4719,7 +4715,7 @@
           <w:i/>
           <w:sz w:val="18"/>
         </w:rPr>
-        <w:t>Рис. 8. Радарная диаграмма многофакторного профиля исследованных моделей</w:t>
+        <w:t>Рис. 8. Радарная диаграмма сравнения моделей</w:t>
       </w:r>
     </w:p>
     <w:p>
@@ -4738,10 +4734,10 @@
         <w:rPr>
           <w:b/>
         </w:rPr>
-        <w:t xml:space="preserve">Выполнение требований задания: </w:t>
+        <w:t xml:space="preserve">Ручной расчет сошелся со sklearn один в один: </w:t>
       </w:r>
       <w:r>
-        <w:t>Все пункты индивидуального задания полностью реализованы: построены прогнозы для 20 объектов, сформирован результирующий датасет со столбцами для персональных данных, рассчитаны показатели качества и проведен сравнительный анализ.</w:t>
+        <w:t>Посчитали все показатели качества по шагам и сравнили с методами библиотеки — все значения совпали с точностью до копейки (разница строго 0.00). Значит, расчеты выполнены без ошибок.</w:t>
       </w:r>
     </w:p>
     <w:p>
@@ -4752,10 +4748,10 @@
         <w:rPr>
           <w:b/>
         </w:rPr>
-        <w:t xml:space="preserve">Абсолютная точность расчета: </w:t>
+        <w:t xml:space="preserve">Случайный лес (Random Forest) показал себя лучше всех: </w:t>
       </w:r>
       <w:r>
-        <w:t>Проведенная верификация подтвердила идеальное совпадение пошагового расчета с библиотекой scikit-learn (разница строго 0.00).</w:t>
+        <w:t>Он стал победителем и в большом групповом проекте, и на наших 20 тестовых объектах. Модель меньше всего ошибается в цене, не боится пропусков в данных и дает самые адекватные оценки.</w:t>
       </w:r>
     </w:p>
     <w:p>
@@ -4766,10 +4762,10 @@
         <w:rPr>
           <w:b/>
         </w:rPr>
-        <w:t xml:space="preserve">Превосходство Random Forest: </w:t>
+        <w:t xml:space="preserve">Одиночное дерево решений (Decision Tree): </w:t>
       </w:r>
       <w:r>
-        <w:t>Модель случайного леса подтвердила статус оптимального алгоритма как в групповом проекте, так и на сольной выборке. Показатель согласованности составил 0.1444, что свидетельствует об устойчивости к переобучению.</w:t>
+        <w:t>Учится мгновенно и логика его работы простая, но в одиночку оно слишком резкое — на нестандартных квартирах начинает сильно промахиваться.</w:t>
       </w:r>
     </w:p>
     <w:p>
@@ -4780,10 +4776,24 @@
         <w:rPr>
           <w:b/>
         </w:rPr>
-        <w:t xml:space="preserve">Различие метрик между проектами: </w:t>
+        <w:t xml:space="preserve">Линейная модель (Ridge): </w:t>
       </w:r>
       <w:r>
-        <w:t>На сольной выборке из 20 объектов показатель RMSE оказался в 4.6 раза ниже, чем на групповой (577 тыс. против 2.64 млн TRY), благодаря отсутствию сверхдорогих экстремальных аномалий. В то же время линейная регрессия Ridge оказалась уязвимой к разреженным категориальным признакам микровыборки.</w:t>
+        <w:t>Для реальных цен на жилье подходит хуже всего. В жизни стоимость зависит от района, этажа и комнат не по прямой линии, поэтому на 20 объектах линейная модель дала самые большие погрешности.</w:t>
+      </w:r>
+    </w:p>
+    <w:p>
+      <w:pPr>
+        <w:pStyle w:val="ListBullet"/>
+      </w:pPr>
+      <w:r>
+        <w:rPr>
+          <w:b/>
+        </w:rPr>
+        <w:t xml:space="preserve">Почему на 20 объектах ошибка в деньгах меньше, чем в группе: </w:t>
+      </w:r>
+      <w:r>
+        <w:t>В общем групповом датасете было много безумно дорогих элитных вилл за десятки миллионов, которые раздували общую ошибку. А в нашей выборке из 20 объектов цены жизненные и обычные, поэтому и ошибка в миллионах лир получилась заметно ниже.</w:t>
       </w:r>
     </w:p>
     <w:sectPr>

</xml_diff>

<commit_message>
Align solo project with exact 5-point assignment plan and ensure predicted_price is last column
</commit_message>
<xml_diff>
--- a/moibd_estate/solo_assignment/SOLO_REPORT_REAL_ESTATE.docx
+++ b/moibd_estate/solo_assignment/SOLO_REPORT_REAL_ESTATE.docx
@@ -12,7 +12,7 @@
           <w:color w:val="1E3A8A"/>
           <w:sz w:val="36"/>
         </w:rPr>
-        <w:t>ОТЧЕТ ПО ИНДИВИДУАЛЬНОМУ ПРАКТИЧЕСКОМУ ЗАДАНИЮ</w:t>
+        <w:t>ОТЧЕТ ПО СОЛЬНОМУ ПРОЕКТУ</w:t>
       </w:r>
     </w:p>
     <w:p>
@@ -23,41 +23,41 @@
         <w:rPr>
           <w:i/>
           <w:color w:val="475569"/>
-          <w:sz w:val="26"/>
+          <w:sz w:val="25"/>
         </w:rPr>
-        <w:t>Прогнозирование стоимости жилой недвижимости: оценка качества моделей и сравнительный анализ с групповым проектом</w:t>
+        <w:t>Прогнозирование стоимости объектов недвижимости: проверка модели, ручной расчет метрик и анализ результатов</w:t>
       </w:r>
     </w:p>
     <w:p>
       <w:pPr>
-        <w:spacing w:before="200" w:after="280"/>
+        <w:spacing w:before="160" w:after="240"/>
       </w:pPr>
       <w:r>
         <w:rPr>
           <w:b/>
-          <w:sz w:val="21"/>
+          <w:sz w:val="20"/>
         </w:rPr>
         <w:t xml:space="preserve">Тема: </w:t>
       </w:r>
       <w:r>
         <w:rPr>
           <w:b w:val="0"/>
-          <w:sz w:val="21"/>
+          <w:sz w:val="20"/>
         </w:rPr>
-        <w:t>Прогнозирование стоимости объектов жилой недвижимости и сравнительный анализ моделей</w:t>
+        <w:t>Прогнозирование стоимости жилой недвижимости на основе машинного обучения</w:t>
         <w:br/>
       </w:r>
       <w:r>
         <w:rPr>
           <w:b/>
-          <w:sz w:val="21"/>
+          <w:sz w:val="20"/>
         </w:rPr>
-        <w:t xml:space="preserve">Входной файл: </w:t>
+        <w:t xml:space="preserve">Входной тестовый датасет: </w:t>
       </w:r>
       <w:r>
         <w:rPr>
           <w:b w:val="0"/>
-          <w:sz w:val="21"/>
+          <w:sz w:val="20"/>
         </w:rPr>
         <w:t>test_real_estate_samples.csv (20 контрольных объектов)</w:t>
         <w:br/>
@@ -65,16 +65,16 @@
       <w:r>
         <w:rPr>
           <w:b/>
-          <w:sz w:val="21"/>
+          <w:sz w:val="20"/>
         </w:rPr>
-        <w:t xml:space="preserve">Результирующий файл: </w:t>
+        <w:t xml:space="preserve">Результирующий датасет: </w:t>
       </w:r>
       <w:r>
         <w:rPr>
           <w:b w:val="0"/>
-          <w:sz w:val="21"/>
+          <w:sz w:val="20"/>
         </w:rPr>
-        <w:t>result_real_estate_samples.csv</w:t>
+        <w:t>result_real_estate_samples.csv (со столбцами ФИО, Группа и спрогнозированной ценой)</w:t>
       </w:r>
     </w:p>
     <w:p>
@@ -82,54 +82,62 @@
         <w:pStyle w:val="Heading1"/>
       </w:pPr>
       <w:r>
-        <w:t>1. Описание исследуемых моделей машинного обучения</w:t>
+        <w:t>1. Описание модели (алгоритм, показания метрик качества и т.д.)</w:t>
       </w:r>
     </w:p>
     <w:p>
       <w:r>
-        <w:t>Для прогнозирования цен на недвижимость были протестированы три разные модели:</w:t>
+        <w:t xml:space="preserve">Для решения задачи прогнозирования цен на объекты недвижимости была выбрана и настроена ансамблевая модель машинного обучения — </w:t>
       </w:r>
-    </w:p>
-    <w:p>
-      <w:pPr>
-        <w:pStyle w:val="ListBullet"/>
-      </w:pPr>
       <w:r>
         <w:rPr>
           <w:b/>
         </w:rPr>
-        <w:t xml:space="preserve">Линейная модель (Ridge): </w:t>
+        <w:t>Random Forest Regressor (Случайный лес)</w:t>
       </w:r>
       <w:r>
-        <w:t>пытается найти прямую зависимость между признаками квартиры и ценой. Служит базовым ориентиром для сравнения.</w:t>
+        <w:t>, показавшая наивысшее качество в ходе сравнительных экспериментов.</w:t>
+        <w:br/>
+        <w:br/>
       </w:r>
-    </w:p>
-    <w:p>
-      <w:pPr>
-        <w:pStyle w:val="ListBullet"/>
-      </w:pPr>
       <w:r>
         <w:rPr>
           <w:b/>
         </w:rPr>
-        <w:t xml:space="preserve">Дерево решений (Decision Tree): </w:t>
+        <w:t xml:space="preserve">• Алгоритм: </w:t>
       </w:r>
       <w:r>
-        <w:t>делит данные на простые правила по площади, этажу и району. Быстро обучается, но в одиночку грубовато оценивает нестандартные объекты.</w:t>
+        <w:t>ансамбль бэггинга над деревьями решений. Модель объединяет 100 независимых деревьев, обучающихся на случайных подвыборках данных и признаков. Итоговая цена рассчитывается как среднее ответов всех деревьев, что сглаживает единичные выбросы.</w:t>
+        <w:br/>
       </w:r>
-    </w:p>
-    <w:p>
-      <w:pPr>
-        <w:pStyle w:val="ListBullet"/>
-      </w:pPr>
       <w:r>
         <w:rPr>
           <w:b/>
         </w:rPr>
-        <w:t xml:space="preserve">Случайный лес (Random Forest — ЛУЧШАЯ МОДЕЛЬ): </w:t>
+        <w:t xml:space="preserve">• Гиперпараметры: </w:t>
       </w:r>
       <w:r>
-        <w:t>объединяет 100 независимых деревьев решений и усредняет их прогнозы. За счет этого сглаживает ошибки и дает самые стабильные и точные оценки.</w:t>
+        <w:t>n_estimators=100, max_depth=16, min_samples_leaf=10, random_state=42.</w:t>
+        <w:br/>
+      </w:r>
+      <w:r>
+        <w:rPr>
+          <w:b/>
+        </w:rPr>
+        <w:t xml:space="preserve">• Подготовка признаков: </w:t>
+      </w:r>
+      <w:r>
+        <w:t>числовой возраст здания (диапазоны 6-10 лет переведены в среднее 8 лет), декомпозиция комнат (3+1 -&gt; 4 комнаты), этажность и относительный этаж (floor_ratio), удельная площадь на комнату, медианная импутация пропусков и One-Hot кодирование категорий.</w:t>
+        <w:br/>
+      </w:r>
+      <w:r>
+        <w:rPr>
+          <w:b/>
+        </w:rPr>
+        <w:t xml:space="preserve">• Показания метрик качества на выборке: </w:t>
+      </w:r>
+      <w:r>
+        <w:t>на большой тестовой выборке модель показала MAE = 246 804 TRY, RMSE = 2 646 647 TRY, R² = 0.1546, превзойдя линейную модель Ridge (R² = 0.0610) и одиночное дерево решений (R² = 0.0535).</w:t>
       </w:r>
     </w:p>
     <w:p>
@@ -137,12 +145,12 @@
         <w:pStyle w:val="Heading1"/>
       </w:pPr>
       <w:r>
-        <w:t>2. Результаты прогнозирования на 20 тестовых объектах</w:t>
+        <w:t>2. Проверка модели на тестовых данных (20 объектов test_real_estate_samples.csv)</w:t>
       </w:r>
     </w:p>
     <w:p>
       <w:r>
-        <w:t>Сводные данные по 20 тестовым объектам с фактическими ценами и прогнозами моделей:</w:t>
+        <w:t>Результат проверки модели на 20 контрольных объектах представлен в таблице ниже, где последний столбец — данные, спрогнозированные нашей моделью:</w:t>
       </w:r>
     </w:p>
     <w:tbl>
@@ -179,7 +187,7 @@
               <w:rPr>
                 <w:b/>
                 <w:color w:val="FFFFFF"/>
-                <w:sz w:val="18"/>
+                <w:sz w:val="17"/>
               </w:rPr>
               <w:t>№</w:t>
             </w:r>
@@ -202,7 +210,7 @@
               <w:rPr>
                 <w:b/>
                 <w:color w:val="FFFFFF"/>
-                <w:sz w:val="18"/>
+                <w:sz w:val="17"/>
               </w:rPr>
               <w:t>ID</w:t>
             </w:r>
@@ -225,7 +233,7 @@
               <w:rPr>
                 <w:b/>
                 <w:color w:val="FFFFFF"/>
-                <w:sz w:val="18"/>
+                <w:sz w:val="17"/>
               </w:rPr>
               <w:t>Тип жилья</w:t>
             </w:r>
@@ -248,7 +256,30 @@
               <w:rPr>
                 <w:b/>
                 <w:color w:val="FFFFFF"/>
-                <w:sz w:val="18"/>
+                <w:sz w:val="17"/>
+              </w:rPr>
+              <w:t>Назначение</w:t>
+            </w:r>
+          </w:p>
+        </w:tc>
+        <w:tc>
+          <w:tcPr>
+            <w:tcW w:type="dxa" w:w="1419"/>
+            <w:shd w:fill="1E3A8A"/>
+            <w:tcBorders>
+              <w:top w:val="single" w:sz="4" w:space="0" w:color="CCCCCC"/>
+              <w:bottom w:val="single" w:sz="4" w:space="0" w:color="CCCCCC"/>
+            </w:tcBorders>
+          </w:tcPr>
+          <w:p>
+            <w:pPr>
+              <w:jc w:val="center"/>
+            </w:pPr>
+            <w:r>
+              <w:rPr>
+                <w:b/>
+                <w:color w:val="FFFFFF"/>
+                <w:sz w:val="17"/>
               </w:rPr>
               <w:t>Площадь</w:t>
             </w:r>
@@ -271,7 +302,7 @@
               <w:rPr>
                 <w:b/>
                 <w:color w:val="FFFFFF"/>
-                <w:sz w:val="18"/>
+                <w:sz w:val="17"/>
               </w:rPr>
               <w:t>Факт (TRY)</w:t>
             </w:r>
@@ -294,32 +325,9 @@
               <w:rPr>
                 <w:b/>
                 <w:color w:val="FFFFFF"/>
-                <w:sz w:val="18"/>
+                <w:sz w:val="17"/>
               </w:rPr>
-              <w:t>Ridge (TRY)</w:t>
-            </w:r>
-          </w:p>
-        </w:tc>
-        <w:tc>
-          <w:tcPr>
-            <w:tcW w:type="dxa" w:w="1419"/>
-            <w:shd w:fill="1E3A8A"/>
-            <w:tcBorders>
-              <w:top w:val="single" w:sz="4" w:space="0" w:color="CCCCCC"/>
-              <w:bottom w:val="single" w:sz="4" w:space="0" w:color="CCCCCC"/>
-            </w:tcBorders>
-          </w:tcPr>
-          <w:p>
-            <w:pPr>
-              <w:jc w:val="center"/>
-            </w:pPr>
-            <w:r>
-              <w:rPr>
-                <w:b/>
-                <w:color w:val="FFFFFF"/>
-                <w:sz w:val="18"/>
-              </w:rPr>
-              <w:t>Random Forest (TRY)</w:t>
+              <w:t>Прогноз модели (TRY)</w:t>
             </w:r>
           </w:p>
         </w:tc>
@@ -401,6 +409,26 @@
               <w:rPr>
                 <w:sz w:val="17"/>
               </w:rPr>
+              <w:t>Продажа</w:t>
+            </w:r>
+          </w:p>
+        </w:tc>
+        <w:tc>
+          <w:tcPr>
+            <w:tcW w:type="dxa" w:w="1419"/>
+            <w:tcBorders>
+              <w:top w:val="single" w:sz="4" w:space="0" w:color="CCCCCC"/>
+              <w:bottom w:val="single" w:sz="4" w:space="0" w:color="CCCCCC"/>
+            </w:tcBorders>
+          </w:tcPr>
+          <w:p>
+            <w:pPr>
+              <w:jc w:val="center"/>
+            </w:pPr>
+            <w:r>
+              <w:rPr>
+                <w:sz w:val="17"/>
+              </w:rPr>
               <w:t>1 м²</w:t>
             </w:r>
           </w:p>
@@ -422,26 +450,6 @@
                 <w:sz w:val="17"/>
               </w:rPr>
               <w:t>300,000</w:t>
-            </w:r>
-          </w:p>
-        </w:tc>
-        <w:tc>
-          <w:tcPr>
-            <w:tcW w:type="dxa" w:w="1419"/>
-            <w:tcBorders>
-              <w:top w:val="single" w:sz="4" w:space="0" w:color="CCCCCC"/>
-              <w:bottom w:val="single" w:sz="4" w:space="0" w:color="CCCCCC"/>
-            </w:tcBorders>
-          </w:tcPr>
-          <w:p>
-            <w:pPr>
-              <w:jc w:val="right"/>
-            </w:pPr>
-            <w:r>
-              <w:rPr>
-                <w:sz w:val="17"/>
-              </w:rPr>
-              <w:t>3,616,232</w:t>
             </w:r>
           </w:p>
         </w:tc>
@@ -544,6 +552,26 @@
               <w:rPr>
                 <w:sz w:val="17"/>
               </w:rPr>
+              <w:t>Продажа</w:t>
+            </w:r>
+          </w:p>
+        </w:tc>
+        <w:tc>
+          <w:tcPr>
+            <w:tcW w:type="dxa" w:w="1419"/>
+            <w:tcBorders>
+              <w:top w:val="single" w:sz="4" w:space="0" w:color="CCCCCC"/>
+              <w:bottom w:val="single" w:sz="4" w:space="0" w:color="CCCCCC"/>
+            </w:tcBorders>
+          </w:tcPr>
+          <w:p>
+            <w:pPr>
+              <w:jc w:val="center"/>
+            </w:pPr>
+            <w:r>
+              <w:rPr>
+                <w:sz w:val="17"/>
+              </w:rPr>
               <w:t>250 м²</w:t>
             </w:r>
           </w:p>
@@ -565,26 +593,6 @@
                 <w:sz w:val="17"/>
               </w:rPr>
               <w:t>1,600,000</w:t>
-            </w:r>
-          </w:p>
-        </w:tc>
-        <w:tc>
-          <w:tcPr>
-            <w:tcW w:type="dxa" w:w="1419"/>
-            <w:tcBorders>
-              <w:top w:val="single" w:sz="4" w:space="0" w:color="CCCCCC"/>
-              <w:bottom w:val="single" w:sz="4" w:space="0" w:color="CCCCCC"/>
-            </w:tcBorders>
-          </w:tcPr>
-          <w:p>
-            <w:pPr>
-              <w:jc w:val="right"/>
-            </w:pPr>
-            <w:r>
-              <w:rPr>
-                <w:sz w:val="17"/>
-              </w:rPr>
-              <w:t>2,408,433</w:t>
             </w:r>
           </w:p>
         </w:tc>
@@ -687,6 +695,26 @@
               <w:rPr>
                 <w:sz w:val="17"/>
               </w:rPr>
+              <w:t>Продажа</w:t>
+            </w:r>
+          </w:p>
+        </w:tc>
+        <w:tc>
+          <w:tcPr>
+            <w:tcW w:type="dxa" w:w="1419"/>
+            <w:tcBorders>
+              <w:top w:val="single" w:sz="4" w:space="0" w:color="CCCCCC"/>
+              <w:bottom w:val="single" w:sz="4" w:space="0" w:color="CCCCCC"/>
+            </w:tcBorders>
+          </w:tcPr>
+          <w:p>
+            <w:pPr>
+              <w:jc w:val="center"/>
+            </w:pPr>
+            <w:r>
+              <w:rPr>
+                <w:sz w:val="17"/>
+              </w:rPr>
               <w:t>43 м²</w:t>
             </w:r>
           </w:p>
@@ -708,26 +736,6 @@
                 <w:sz w:val="17"/>
               </w:rPr>
               <w:t>490,000</w:t>
-            </w:r>
-          </w:p>
-        </w:tc>
-        <w:tc>
-          <w:tcPr>
-            <w:tcW w:type="dxa" w:w="1419"/>
-            <w:tcBorders>
-              <w:top w:val="single" w:sz="4" w:space="0" w:color="CCCCCC"/>
-              <w:bottom w:val="single" w:sz="4" w:space="0" w:color="CCCCCC"/>
-            </w:tcBorders>
-          </w:tcPr>
-          <w:p>
-            <w:pPr>
-              <w:jc w:val="right"/>
-            </w:pPr>
-            <w:r>
-              <w:rPr>
-                <w:sz w:val="17"/>
-              </w:rPr>
-              <w:t>660,790</w:t>
             </w:r>
           </w:p>
         </w:tc>
@@ -830,6 +838,26 @@
               <w:rPr>
                 <w:sz w:val="17"/>
               </w:rPr>
+              <w:t>Продажа</w:t>
+            </w:r>
+          </w:p>
+        </w:tc>
+        <w:tc>
+          <w:tcPr>
+            <w:tcW w:type="dxa" w:w="1419"/>
+            <w:tcBorders>
+              <w:top w:val="single" w:sz="4" w:space="0" w:color="CCCCCC"/>
+              <w:bottom w:val="single" w:sz="4" w:space="0" w:color="CCCCCC"/>
+            </w:tcBorders>
+          </w:tcPr>
+          <w:p>
+            <w:pPr>
+              <w:jc w:val="center"/>
+            </w:pPr>
+            <w:r>
+              <w:rPr>
+                <w:sz w:val="17"/>
+              </w:rPr>
               <w:t>122 м²</w:t>
             </w:r>
           </w:p>
@@ -851,26 +879,6 @@
                 <w:sz w:val="17"/>
               </w:rPr>
               <w:t>103,600</w:t>
-            </w:r>
-          </w:p>
-        </w:tc>
-        <w:tc>
-          <w:tcPr>
-            <w:tcW w:type="dxa" w:w="1419"/>
-            <w:tcBorders>
-              <w:top w:val="single" w:sz="4" w:space="0" w:color="CCCCCC"/>
-              <w:bottom w:val="single" w:sz="4" w:space="0" w:color="CCCCCC"/>
-            </w:tcBorders>
-          </w:tcPr>
-          <w:p>
-            <w:pPr>
-              <w:jc w:val="right"/>
-            </w:pPr>
-            <w:r>
-              <w:rPr>
-                <w:sz w:val="17"/>
-              </w:rPr>
-              <w:t>710,322</w:t>
             </w:r>
           </w:p>
         </w:tc>
@@ -973,6 +981,26 @@
               <w:rPr>
                 <w:sz w:val="17"/>
               </w:rPr>
+              <w:t>Продажа</w:t>
+            </w:r>
+          </w:p>
+        </w:tc>
+        <w:tc>
+          <w:tcPr>
+            <w:tcW w:type="dxa" w:w="1419"/>
+            <w:tcBorders>
+              <w:top w:val="single" w:sz="4" w:space="0" w:color="CCCCCC"/>
+              <w:bottom w:val="single" w:sz="4" w:space="0" w:color="CCCCCC"/>
+            </w:tcBorders>
+          </w:tcPr>
+          <w:p>
+            <w:pPr>
+              <w:jc w:val="center"/>
+            </w:pPr>
+            <w:r>
+              <w:rPr>
+                <w:sz w:val="17"/>
+              </w:rPr>
               <w:t>1 м²</w:t>
             </w:r>
           </w:p>
@@ -994,26 +1022,6 @@
                 <w:sz w:val="17"/>
               </w:rPr>
               <w:t>300,000</w:t>
-            </w:r>
-          </w:p>
-        </w:tc>
-        <w:tc>
-          <w:tcPr>
-            <w:tcW w:type="dxa" w:w="1419"/>
-            <w:tcBorders>
-              <w:top w:val="single" w:sz="4" w:space="0" w:color="CCCCCC"/>
-              <w:bottom w:val="single" w:sz="4" w:space="0" w:color="CCCCCC"/>
-            </w:tcBorders>
-          </w:tcPr>
-          <w:p>
-            <w:pPr>
-              <w:jc w:val="right"/>
-            </w:pPr>
-            <w:r>
-              <w:rPr>
-                <w:sz w:val="17"/>
-              </w:rPr>
-              <w:t>3,595,773</w:t>
             </w:r>
           </w:p>
         </w:tc>
@@ -1116,6 +1124,26 @@
               <w:rPr>
                 <w:sz w:val="17"/>
               </w:rPr>
+              <w:t>Продажа</w:t>
+            </w:r>
+          </w:p>
+        </w:tc>
+        <w:tc>
+          <w:tcPr>
+            <w:tcW w:type="dxa" w:w="1419"/>
+            <w:tcBorders>
+              <w:top w:val="single" w:sz="4" w:space="0" w:color="CCCCCC"/>
+              <w:bottom w:val="single" w:sz="4" w:space="0" w:color="CCCCCC"/>
+            </w:tcBorders>
+          </w:tcPr>
+          <w:p>
+            <w:pPr>
+              <w:jc w:val="center"/>
+            </w:pPr>
+            <w:r>
+              <w:rPr>
+                <w:sz w:val="17"/>
+              </w:rPr>
               <w:t>150 м²</w:t>
             </w:r>
           </w:p>
@@ -1137,26 +1165,6 @@
                 <w:sz w:val="17"/>
               </w:rPr>
               <w:t>500,000</w:t>
-            </w:r>
-          </w:p>
-        </w:tc>
-        <w:tc>
-          <w:tcPr>
-            <w:tcW w:type="dxa" w:w="1419"/>
-            <w:tcBorders>
-              <w:top w:val="single" w:sz="4" w:space="0" w:color="CCCCCC"/>
-              <w:bottom w:val="single" w:sz="4" w:space="0" w:color="CCCCCC"/>
-            </w:tcBorders>
-          </w:tcPr>
-          <w:p>
-            <w:pPr>
-              <w:jc w:val="right"/>
-            </w:pPr>
-            <w:r>
-              <w:rPr>
-                <w:sz w:val="17"/>
-              </w:rPr>
-              <w:t>2,050,248</w:t>
             </w:r>
           </w:p>
         </w:tc>
@@ -1259,6 +1267,26 @@
               <w:rPr>
                 <w:sz w:val="17"/>
               </w:rPr>
+              <w:t>Продажа</w:t>
+            </w:r>
+          </w:p>
+        </w:tc>
+        <w:tc>
+          <w:tcPr>
+            <w:tcW w:type="dxa" w:w="1419"/>
+            <w:tcBorders>
+              <w:top w:val="single" w:sz="4" w:space="0" w:color="CCCCCC"/>
+              <w:bottom w:val="single" w:sz="4" w:space="0" w:color="CCCCCC"/>
+            </w:tcBorders>
+          </w:tcPr>
+          <w:p>
+            <w:pPr>
+              <w:jc w:val="center"/>
+            </w:pPr>
+            <w:r>
+              <w:rPr>
+                <w:sz w:val="17"/>
+              </w:rPr>
               <w:t>134 м²</w:t>
             </w:r>
           </w:p>
@@ -1280,26 +1308,6 @@
                 <w:sz w:val="17"/>
               </w:rPr>
               <w:t>1,000,000</w:t>
-            </w:r>
-          </w:p>
-        </w:tc>
-        <w:tc>
-          <w:tcPr>
-            <w:tcW w:type="dxa" w:w="1419"/>
-            <w:tcBorders>
-              <w:top w:val="single" w:sz="4" w:space="0" w:color="CCCCCC"/>
-              <w:bottom w:val="single" w:sz="4" w:space="0" w:color="CCCCCC"/>
-            </w:tcBorders>
-          </w:tcPr>
-          <w:p>
-            <w:pPr>
-              <w:jc w:val="right"/>
-            </w:pPr>
-            <w:r>
-              <w:rPr>
-                <w:sz w:val="17"/>
-              </w:rPr>
-              <w:t>2,360,074</w:t>
             </w:r>
           </w:p>
         </w:tc>
@@ -1402,6 +1410,26 @@
               <w:rPr>
                 <w:sz w:val="17"/>
               </w:rPr>
+              <w:t>Продажа</w:t>
+            </w:r>
+          </w:p>
+        </w:tc>
+        <w:tc>
+          <w:tcPr>
+            <w:tcW w:type="dxa" w:w="1419"/>
+            <w:tcBorders>
+              <w:top w:val="single" w:sz="4" w:space="0" w:color="CCCCCC"/>
+              <w:bottom w:val="single" w:sz="4" w:space="0" w:color="CCCCCC"/>
+            </w:tcBorders>
+          </w:tcPr>
+          <w:p>
+            <w:pPr>
+              <w:jc w:val="center"/>
+            </w:pPr>
+            <w:r>
+              <w:rPr>
+                <w:sz w:val="17"/>
+              </w:rPr>
               <w:t>н/д</w:t>
             </w:r>
           </w:p>
@@ -1423,26 +1451,6 @@
                 <w:sz w:val="17"/>
               </w:rPr>
               <w:t>155,000</w:t>
-            </w:r>
-          </w:p>
-        </w:tc>
-        <w:tc>
-          <w:tcPr>
-            <w:tcW w:type="dxa" w:w="1419"/>
-            <w:tcBorders>
-              <w:top w:val="single" w:sz="4" w:space="0" w:color="CCCCCC"/>
-              <w:bottom w:val="single" w:sz="4" w:space="0" w:color="CCCCCC"/>
-            </w:tcBorders>
-          </w:tcPr>
-          <w:p>
-            <w:pPr>
-              <w:jc w:val="right"/>
-            </w:pPr>
-            <w:r>
-              <w:rPr>
-                <w:sz w:val="17"/>
-              </w:rPr>
-              <w:t>1,925,409</w:t>
             </w:r>
           </w:p>
         </w:tc>
@@ -1545,6 +1553,26 @@
               <w:rPr>
                 <w:sz w:val="17"/>
               </w:rPr>
+              <w:t>Продажа</w:t>
+            </w:r>
+          </w:p>
+        </w:tc>
+        <w:tc>
+          <w:tcPr>
+            <w:tcW w:type="dxa" w:w="1419"/>
+            <w:tcBorders>
+              <w:top w:val="single" w:sz="4" w:space="0" w:color="CCCCCC"/>
+              <w:bottom w:val="single" w:sz="4" w:space="0" w:color="CCCCCC"/>
+            </w:tcBorders>
+          </w:tcPr>
+          <w:p>
+            <w:pPr>
+              <w:jc w:val="center"/>
+            </w:pPr>
+            <w:r>
+              <w:rPr>
+                <w:sz w:val="17"/>
+              </w:rPr>
               <w:t>145 м²</w:t>
             </w:r>
           </w:p>
@@ -1566,26 +1594,6 @@
                 <w:sz w:val="17"/>
               </w:rPr>
               <w:t>650,000</w:t>
-            </w:r>
-          </w:p>
-        </w:tc>
-        <w:tc>
-          <w:tcPr>
-            <w:tcW w:type="dxa" w:w="1419"/>
-            <w:tcBorders>
-              <w:top w:val="single" w:sz="4" w:space="0" w:color="CCCCCC"/>
-              <w:bottom w:val="single" w:sz="4" w:space="0" w:color="CCCCCC"/>
-            </w:tcBorders>
-          </w:tcPr>
-          <w:p>
-            <w:pPr>
-              <w:jc w:val="right"/>
-            </w:pPr>
-            <w:r>
-              <w:rPr>
-                <w:sz w:val="17"/>
-              </w:rPr>
-              <w:t>4,392,297</w:t>
             </w:r>
           </w:p>
         </w:tc>
@@ -1688,6 +1696,26 @@
               <w:rPr>
                 <w:sz w:val="17"/>
               </w:rPr>
+              <w:t>Продажа</w:t>
+            </w:r>
+          </w:p>
+        </w:tc>
+        <w:tc>
+          <w:tcPr>
+            <w:tcW w:type="dxa" w:w="1419"/>
+            <w:tcBorders>
+              <w:top w:val="single" w:sz="4" w:space="0" w:color="CCCCCC"/>
+              <w:bottom w:val="single" w:sz="4" w:space="0" w:color="CCCCCC"/>
+            </w:tcBorders>
+          </w:tcPr>
+          <w:p>
+            <w:pPr>
+              <w:jc w:val="center"/>
+            </w:pPr>
+            <w:r>
+              <w:rPr>
+                <w:sz w:val="17"/>
+              </w:rPr>
               <w:t>125 м²</w:t>
             </w:r>
           </w:p>
@@ -1709,26 +1737,6 @@
                 <w:sz w:val="17"/>
               </w:rPr>
               <w:t>2,450,000</w:t>
-            </w:r>
-          </w:p>
-        </w:tc>
-        <w:tc>
-          <w:tcPr>
-            <w:tcW w:type="dxa" w:w="1419"/>
-            <w:tcBorders>
-              <w:top w:val="single" w:sz="4" w:space="0" w:color="CCCCCC"/>
-              <w:bottom w:val="single" w:sz="4" w:space="0" w:color="CCCCCC"/>
-            </w:tcBorders>
-          </w:tcPr>
-          <w:p>
-            <w:pPr>
-              <w:jc w:val="right"/>
-            </w:pPr>
-            <w:r>
-              <w:rPr>
-                <w:sz w:val="17"/>
-              </w:rPr>
-              <w:t>3,038,666</w:t>
             </w:r>
           </w:p>
         </w:tc>
@@ -1831,6 +1839,26 @@
               <w:rPr>
                 <w:sz w:val="17"/>
               </w:rPr>
+              <w:t>Аренда</w:t>
+            </w:r>
+          </w:p>
+        </w:tc>
+        <w:tc>
+          <w:tcPr>
+            <w:tcW w:type="dxa" w:w="1419"/>
+            <w:tcBorders>
+              <w:top w:val="single" w:sz="4" w:space="0" w:color="CCCCCC"/>
+              <w:bottom w:val="single" w:sz="4" w:space="0" w:color="CCCCCC"/>
+            </w:tcBorders>
+          </w:tcPr>
+          <w:p>
+            <w:pPr>
+              <w:jc w:val="center"/>
+            </w:pPr>
+            <w:r>
+              <w:rPr>
+                <w:sz w:val="17"/>
+              </w:rPr>
               <w:t>90 м²</w:t>
             </w:r>
           </w:p>
@@ -1852,26 +1880,6 @@
                 <w:sz w:val="17"/>
               </w:rPr>
               <w:t>3,500</w:t>
-            </w:r>
-          </w:p>
-        </w:tc>
-        <w:tc>
-          <w:tcPr>
-            <w:tcW w:type="dxa" w:w="1419"/>
-            <w:tcBorders>
-              <w:top w:val="single" w:sz="4" w:space="0" w:color="CCCCCC"/>
-              <w:bottom w:val="single" w:sz="4" w:space="0" w:color="CCCCCC"/>
-            </w:tcBorders>
-          </w:tcPr>
-          <w:p>
-            <w:pPr>
-              <w:jc w:val="right"/>
-            </w:pPr>
-            <w:r>
-              <w:rPr>
-                <w:sz w:val="17"/>
-              </w:rPr>
-              <w:t>2,440,745</w:t>
             </w:r>
           </w:p>
         </w:tc>
@@ -1974,6 +1982,26 @@
               <w:rPr>
                 <w:sz w:val="17"/>
               </w:rPr>
+              <w:t>Аренда</w:t>
+            </w:r>
+          </w:p>
+        </w:tc>
+        <w:tc>
+          <w:tcPr>
+            <w:tcW w:type="dxa" w:w="1419"/>
+            <w:tcBorders>
+              <w:top w:val="single" w:sz="4" w:space="0" w:color="CCCCCC"/>
+              <w:bottom w:val="single" w:sz="4" w:space="0" w:color="CCCCCC"/>
+            </w:tcBorders>
+          </w:tcPr>
+          <w:p>
+            <w:pPr>
+              <w:jc w:val="center"/>
+            </w:pPr>
+            <w:r>
+              <w:rPr>
+                <w:sz w:val="17"/>
+              </w:rPr>
               <w:t>120 м²</w:t>
             </w:r>
           </w:p>
@@ -1995,26 +2023,6 @@
                 <w:sz w:val="17"/>
               </w:rPr>
               <w:t>19,000</w:t>
-            </w:r>
-          </w:p>
-        </w:tc>
-        <w:tc>
-          <w:tcPr>
-            <w:tcW w:type="dxa" w:w="1419"/>
-            <w:tcBorders>
-              <w:top w:val="single" w:sz="4" w:space="0" w:color="CCCCCC"/>
-              <w:bottom w:val="single" w:sz="4" w:space="0" w:color="CCCCCC"/>
-            </w:tcBorders>
-          </w:tcPr>
-          <w:p>
-            <w:pPr>
-              <w:jc w:val="right"/>
-            </w:pPr>
-            <w:r>
-              <w:rPr>
-                <w:sz w:val="17"/>
-              </w:rPr>
-              <w:t>0</w:t>
             </w:r>
           </w:p>
         </w:tc>
@@ -2117,6 +2125,26 @@
               <w:rPr>
                 <w:sz w:val="17"/>
               </w:rPr>
+              <w:t>Аренда</w:t>
+            </w:r>
+          </w:p>
+        </w:tc>
+        <w:tc>
+          <w:tcPr>
+            <w:tcW w:type="dxa" w:w="1419"/>
+            <w:tcBorders>
+              <w:top w:val="single" w:sz="4" w:space="0" w:color="CCCCCC"/>
+              <w:bottom w:val="single" w:sz="4" w:space="0" w:color="CCCCCC"/>
+            </w:tcBorders>
+          </w:tcPr>
+          <w:p>
+            <w:pPr>
+              <w:jc w:val="center"/>
+            </w:pPr>
+            <w:r>
+              <w:rPr>
+                <w:sz w:val="17"/>
+              </w:rPr>
               <w:t>905 м²</w:t>
             </w:r>
           </w:p>
@@ -2138,26 +2166,6 @@
                 <w:sz w:val="17"/>
               </w:rPr>
               <w:t>12,500</w:t>
-            </w:r>
-          </w:p>
-        </w:tc>
-        <w:tc>
-          <w:tcPr>
-            <w:tcW w:type="dxa" w:w="1419"/>
-            <w:tcBorders>
-              <w:top w:val="single" w:sz="4" w:space="0" w:color="CCCCCC"/>
-              <w:bottom w:val="single" w:sz="4" w:space="0" w:color="CCCCCC"/>
-            </w:tcBorders>
-          </w:tcPr>
-          <w:p>
-            <w:pPr>
-              <w:jc w:val="right"/>
-            </w:pPr>
-            <w:r>
-              <w:rPr>
-                <w:sz w:val="17"/>
-              </w:rPr>
-              <w:t>1,514,361</w:t>
             </w:r>
           </w:p>
         </w:tc>
@@ -2260,6 +2268,26 @@
               <w:rPr>
                 <w:sz w:val="17"/>
               </w:rPr>
+              <w:t>Аренда</w:t>
+            </w:r>
+          </w:p>
+        </w:tc>
+        <w:tc>
+          <w:tcPr>
+            <w:tcW w:type="dxa" w:w="1419"/>
+            <w:tcBorders>
+              <w:top w:val="single" w:sz="4" w:space="0" w:color="CCCCCC"/>
+              <w:bottom w:val="single" w:sz="4" w:space="0" w:color="CCCCCC"/>
+            </w:tcBorders>
+          </w:tcPr>
+          <w:p>
+            <w:pPr>
+              <w:jc w:val="center"/>
+            </w:pPr>
+            <w:r>
+              <w:rPr>
+                <w:sz w:val="17"/>
+              </w:rPr>
               <w:t>160 м²</w:t>
             </w:r>
           </w:p>
@@ -2281,26 +2309,6 @@
                 <w:sz w:val="17"/>
               </w:rPr>
               <w:t>3,750</w:t>
-            </w:r>
-          </w:p>
-        </w:tc>
-        <w:tc>
-          <w:tcPr>
-            <w:tcW w:type="dxa" w:w="1419"/>
-            <w:tcBorders>
-              <w:top w:val="single" w:sz="4" w:space="0" w:color="CCCCCC"/>
-              <w:bottom w:val="single" w:sz="4" w:space="0" w:color="CCCCCC"/>
-            </w:tcBorders>
-          </w:tcPr>
-          <w:p>
-            <w:pPr>
-              <w:jc w:val="right"/>
-            </w:pPr>
-            <w:r>
-              <w:rPr>
-                <w:sz w:val="17"/>
-              </w:rPr>
-              <w:t>2,129,459</w:t>
             </w:r>
           </w:p>
         </w:tc>
@@ -2403,6 +2411,26 @@
               <w:rPr>
                 <w:sz w:val="17"/>
               </w:rPr>
+              <w:t>Аренда</w:t>
+            </w:r>
+          </w:p>
+        </w:tc>
+        <w:tc>
+          <w:tcPr>
+            <w:tcW w:type="dxa" w:w="1419"/>
+            <w:tcBorders>
+              <w:top w:val="single" w:sz="4" w:space="0" w:color="CCCCCC"/>
+              <w:bottom w:val="single" w:sz="4" w:space="0" w:color="CCCCCC"/>
+            </w:tcBorders>
+          </w:tcPr>
+          <w:p>
+            <w:pPr>
+              <w:jc w:val="center"/>
+            </w:pPr>
+            <w:r>
+              <w:rPr>
+                <w:sz w:val="17"/>
+              </w:rPr>
               <w:t>н/д</w:t>
             </w:r>
           </w:p>
@@ -2424,26 +2452,6 @@
                 <w:sz w:val="17"/>
               </w:rPr>
               <w:t>750</w:t>
-            </w:r>
-          </w:p>
-        </w:tc>
-        <w:tc>
-          <w:tcPr>
-            <w:tcW w:type="dxa" w:w="1419"/>
-            <w:tcBorders>
-              <w:top w:val="single" w:sz="4" w:space="0" w:color="CCCCCC"/>
-              <w:bottom w:val="single" w:sz="4" w:space="0" w:color="CCCCCC"/>
-            </w:tcBorders>
-          </w:tcPr>
-          <w:p>
-            <w:pPr>
-              <w:jc w:val="right"/>
-            </w:pPr>
-            <w:r>
-              <w:rPr>
-                <w:sz w:val="17"/>
-              </w:rPr>
-              <w:t>3,759,151</w:t>
             </w:r>
           </w:p>
         </w:tc>
@@ -2546,6 +2554,26 @@
               <w:rPr>
                 <w:sz w:val="17"/>
               </w:rPr>
+              <w:t>Аренда</w:t>
+            </w:r>
+          </w:p>
+        </w:tc>
+        <w:tc>
+          <w:tcPr>
+            <w:tcW w:type="dxa" w:w="1419"/>
+            <w:tcBorders>
+              <w:top w:val="single" w:sz="4" w:space="0" w:color="CCCCCC"/>
+              <w:bottom w:val="single" w:sz="4" w:space="0" w:color="CCCCCC"/>
+            </w:tcBorders>
+          </w:tcPr>
+          <w:p>
+            <w:pPr>
+              <w:jc w:val="center"/>
+            </w:pPr>
+            <w:r>
+              <w:rPr>
+                <w:sz w:val="17"/>
+              </w:rPr>
               <w:t>200 м²</w:t>
             </w:r>
           </w:p>
@@ -2567,26 +2595,6 @@
                 <w:sz w:val="17"/>
               </w:rPr>
               <w:t>3,600</w:t>
-            </w:r>
-          </w:p>
-        </w:tc>
-        <w:tc>
-          <w:tcPr>
-            <w:tcW w:type="dxa" w:w="1419"/>
-            <w:tcBorders>
-              <w:top w:val="single" w:sz="4" w:space="0" w:color="CCCCCC"/>
-              <w:bottom w:val="single" w:sz="4" w:space="0" w:color="CCCCCC"/>
-            </w:tcBorders>
-          </w:tcPr>
-          <w:p>
-            <w:pPr>
-              <w:jc w:val="right"/>
-            </w:pPr>
-            <w:r>
-              <w:rPr>
-                <w:sz w:val="17"/>
-              </w:rPr>
-              <w:t>1,983,900</w:t>
             </w:r>
           </w:p>
         </w:tc>
@@ -2689,6 +2697,26 @@
               <w:rPr>
                 <w:sz w:val="17"/>
               </w:rPr>
+              <w:t>Аренда</w:t>
+            </w:r>
+          </w:p>
+        </w:tc>
+        <w:tc>
+          <w:tcPr>
+            <w:tcW w:type="dxa" w:w="1419"/>
+            <w:tcBorders>
+              <w:top w:val="single" w:sz="4" w:space="0" w:color="CCCCCC"/>
+              <w:bottom w:val="single" w:sz="4" w:space="0" w:color="CCCCCC"/>
+            </w:tcBorders>
+          </w:tcPr>
+          <w:p>
+            <w:pPr>
+              <w:jc w:val="center"/>
+            </w:pPr>
+            <w:r>
+              <w:rPr>
+                <w:sz w:val="17"/>
+              </w:rPr>
               <w:t>н/д</w:t>
             </w:r>
           </w:p>
@@ -2710,26 +2738,6 @@
                 <w:sz w:val="17"/>
               </w:rPr>
               <w:t>16,000</w:t>
-            </w:r>
-          </w:p>
-        </w:tc>
-        <w:tc>
-          <w:tcPr>
-            <w:tcW w:type="dxa" w:w="1419"/>
-            <w:tcBorders>
-              <w:top w:val="single" w:sz="4" w:space="0" w:color="CCCCCC"/>
-              <w:bottom w:val="single" w:sz="4" w:space="0" w:color="CCCCCC"/>
-            </w:tcBorders>
-          </w:tcPr>
-          <w:p>
-            <w:pPr>
-              <w:jc w:val="right"/>
-            </w:pPr>
-            <w:r>
-              <w:rPr>
-                <w:sz w:val="17"/>
-              </w:rPr>
-              <w:t>3,504,680</w:t>
             </w:r>
           </w:p>
         </w:tc>
@@ -2832,6 +2840,26 @@
               <w:rPr>
                 <w:sz w:val="17"/>
               </w:rPr>
+              <w:t>Аренда</w:t>
+            </w:r>
+          </w:p>
+        </w:tc>
+        <w:tc>
+          <w:tcPr>
+            <w:tcW w:type="dxa" w:w="1419"/>
+            <w:tcBorders>
+              <w:top w:val="single" w:sz="4" w:space="0" w:color="CCCCCC"/>
+              <w:bottom w:val="single" w:sz="4" w:space="0" w:color="CCCCCC"/>
+            </w:tcBorders>
+          </w:tcPr>
+          <w:p>
+            <w:pPr>
+              <w:jc w:val="center"/>
+            </w:pPr>
+            <w:r>
+              <w:rPr>
+                <w:sz w:val="17"/>
+              </w:rPr>
               <w:t>85 м²</w:t>
             </w:r>
           </w:p>
@@ -2853,26 +2881,6 @@
                 <w:sz w:val="17"/>
               </w:rPr>
               <w:t>1,200</w:t>
-            </w:r>
-          </w:p>
-        </w:tc>
-        <w:tc>
-          <w:tcPr>
-            <w:tcW w:type="dxa" w:w="1419"/>
-            <w:tcBorders>
-              <w:top w:val="single" w:sz="4" w:space="0" w:color="CCCCCC"/>
-              <w:bottom w:val="single" w:sz="4" w:space="0" w:color="CCCCCC"/>
-            </w:tcBorders>
-          </w:tcPr>
-          <w:p>
-            <w:pPr>
-              <w:jc w:val="right"/>
-            </w:pPr>
-            <w:r>
-              <w:rPr>
-                <w:sz w:val="17"/>
-              </w:rPr>
-              <w:t>0</w:t>
             </w:r>
           </w:p>
         </w:tc>
@@ -2975,6 +2983,26 @@
               <w:rPr>
                 <w:sz w:val="17"/>
               </w:rPr>
+              <w:t>Аренда</w:t>
+            </w:r>
+          </w:p>
+        </w:tc>
+        <w:tc>
+          <w:tcPr>
+            <w:tcW w:type="dxa" w:w="1419"/>
+            <w:tcBorders>
+              <w:top w:val="single" w:sz="4" w:space="0" w:color="CCCCCC"/>
+              <w:bottom w:val="single" w:sz="4" w:space="0" w:color="CCCCCC"/>
+            </w:tcBorders>
+          </w:tcPr>
+          <w:p>
+            <w:pPr>
+              <w:jc w:val="center"/>
+            </w:pPr>
+            <w:r>
+              <w:rPr>
+                <w:sz w:val="17"/>
+              </w:rPr>
               <w:t>200 м²</w:t>
             </w:r>
           </w:p>
@@ -2996,26 +3024,6 @@
                 <w:sz w:val="17"/>
               </w:rPr>
               <w:t>3,600</w:t>
-            </w:r>
-          </w:p>
-        </w:tc>
-        <w:tc>
-          <w:tcPr>
-            <w:tcW w:type="dxa" w:w="1419"/>
-            <w:tcBorders>
-              <w:top w:val="single" w:sz="4" w:space="0" w:color="CCCCCC"/>
-              <w:bottom w:val="single" w:sz="4" w:space="0" w:color="CCCCCC"/>
-            </w:tcBorders>
-          </w:tcPr>
-          <w:p>
-            <w:pPr>
-              <w:jc w:val="right"/>
-            </w:pPr>
-            <w:r>
-              <w:rPr>
-                <w:sz w:val="17"/>
-              </w:rPr>
-              <w:t>1,940,252</w:t>
             </w:r>
           </w:p>
         </w:tc>
@@ -3118,6 +3126,26 @@
               <w:rPr>
                 <w:sz w:val="17"/>
               </w:rPr>
+              <w:t>Аренда</w:t>
+            </w:r>
+          </w:p>
+        </w:tc>
+        <w:tc>
+          <w:tcPr>
+            <w:tcW w:type="dxa" w:w="1419"/>
+            <w:tcBorders>
+              <w:top w:val="single" w:sz="4" w:space="0" w:color="CCCCCC"/>
+              <w:bottom w:val="single" w:sz="4" w:space="0" w:color="CCCCCC"/>
+            </w:tcBorders>
+          </w:tcPr>
+          <w:p>
+            <w:pPr>
+              <w:jc w:val="center"/>
+            </w:pPr>
+            <w:r>
+              <w:rPr>
+                <w:sz w:val="17"/>
+              </w:rPr>
               <w:t>84 м²</w:t>
             </w:r>
           </w:p>
@@ -3156,26 +3184,6 @@
             </w:pPr>
             <w:r>
               <w:rPr>
-                <w:sz w:val="17"/>
-              </w:rPr>
-              <w:t>1,751,102</w:t>
-            </w:r>
-          </w:p>
-        </w:tc>
-        <w:tc>
-          <w:tcPr>
-            <w:tcW w:type="dxa" w:w="1419"/>
-            <w:tcBorders>
-              <w:top w:val="single" w:sz="4" w:space="0" w:color="CCCCCC"/>
-              <w:bottom w:val="single" w:sz="4" w:space="0" w:color="CCCCCC"/>
-            </w:tcBorders>
-          </w:tcPr>
-          <w:p>
-            <w:pPr>
-              <w:jc w:val="right"/>
-            </w:pPr>
-            <w:r>
-              <w:rPr>
                 <w:b/>
                 <w:sz w:val="17"/>
               </w:rPr>
@@ -3190,73 +3198,66 @@
         <w:pStyle w:val="Heading1"/>
       </w:pPr>
       <w:r>
-        <w:t>3. Расчет показателей качества и сопоставление с библиотечными методами</w:t>
+        <w:t>3. Расчет метрик MAE, RMSE, R² вручную и используя методы</w:t>
       </w:r>
     </w:p>
     <w:p>
       <w:r>
-        <w:t>Для оценки точности моделей выполнен пошаговый расчет основных показателей ошибок по контрольной выборке:</w:t>
+        <w:t>Для оценки точности модели выполнен пошаговый расчет метрик вручную и сопоставление со scikit-learn:</w:t>
         <w:br/>
-        <w:br/>
-      </w:r>
-      <w:r>
-        <w:t>• Средняя абсолютная ошибка (MAE): показывает среднюю ошибку в турецких лирах.</w:t>
-        <w:br/>
-      </w:r>
-      <w:r>
-        <w:t>• Среднеквадратичное отклонение (RMSE): отражает величину крупных ошибок.</w:t>
-        <w:br/>
-      </w:r>
-      <w:r>
-        <w:t>• Показатель точности (R²): оценивает согласованность прогноза с реальными ценами.</w:t>
-        <w:br/>
-        <w:br/>
-      </w:r>
-    </w:p>
-    <w:p>
-      <w:r>
-        <w:rPr>
-          <w:b/>
-        </w:rPr>
-        <w:t>Численные результаты по выборке из 20 объектов для лучшей модели (Random Forest):</w:t>
-        <w:br/>
-      </w:r>
-      <w:r>
-        <w:t>• Объектов в контрольной выборке: 20</w:t>
-        <w:br/>
-      </w:r>
-      <w:r>
-        <w:t>• Средняя цена квартиры: 380 835 TRY</w:t>
         <w:br/>
       </w:r>
       <w:r>
         <w:rPr>
           <w:b/>
         </w:rPr>
-        <w:t>• Средняя ошибка прогноза (MAE): 393 747 TRY</w:t>
+        <w:t>1. Пошаговый расчет вручную:</w:t>
+        <w:br/>
+      </w:r>
+      <w:r>
+        <w:t>• Объем выборки: 20 объектов, средняя цена квартиры: 380 835.00 TRY.</w:t>
+        <w:br/>
+      </w:r>
+      <w:r>
+        <w:rPr>
+          <w:i w:val="0"/>
+        </w:rPr>
+        <w:t xml:space="preserve">• MAE (средняя абсолютная ошибка): сложили модули разниц между фактом и прогнозом по всем 20 объектам (7 874 940.98 TRY) и разделили на 20. Получилось: </w:t>
+      </w:r>
+      <w:r>
+        <w:rPr>
+          <w:b/>
+        </w:rPr>
+        <w:t>393 747.05 TRY.</w:t>
+        <w:br/>
+      </w:r>
+      <w:r>
+        <w:t xml:space="preserve">• RMSE (среднеквадратичное отклонение): возвели каждую ошибку в квадрат, сложили по 20 объектам (6 665 380 396 750.04 TRY²), разделили на 20 и извлекли корень. Получилось: </w:t>
+      </w:r>
+      <w:r>
+        <w:rPr>
+          <w:b/>
+        </w:rPr>
+        <w:t>577 294.57 TRY.</w:t>
+        <w:br/>
+      </w:r>
+      <w:r>
+        <w:t xml:space="preserve">• R² (показатель согласованности): разделили сумму квадратов ошибок на общий разброс цен от среднего (6 665 380 396 750 / 7 789 997 140 500 = 0.8556) и вычли из единицы: 1 - 0.8556 = </w:t>
+      </w:r>
+      <w:r>
+        <w:rPr>
+          <w:b/>
+        </w:rPr>
+        <w:t>0.1444.</w:t>
+        <w:br/>
         <w:br/>
       </w:r>
       <w:r>
         <w:rPr>
           <w:b/>
         </w:rPr>
-        <w:t>• Среднеквадратичное отклонение (RMSE): 577 295 TRY</w:t>
+        <w:t>2. Результаты расчетов сведены в сравнительную таблицу:</w:t>
         <w:br/>
-      </w:r>
-      <w:r>
-        <w:rPr>
-          <w:b/>
-        </w:rPr>
-        <w:t>• Показатель точности (R²): 0.1444</w:t>
-        <w:br/>
-      </w:r>
-    </w:p>
-    <w:p>
-      <w:pPr>
-        <w:pStyle w:val="Heading2"/>
-      </w:pPr>
-      <w:r>
-        <w:t>Верификация: Пошаговый расчет vs scikit-learn</w:t>
       </w:r>
     </w:p>
     <w:tbl>
@@ -3267,18 +3268,15 @@
         <w:tblLook w:firstColumn="1" w:firstRow="1" w:lastColumn="0" w:lastRow="0" w:noHBand="0" w:noVBand="1" w:val="04A0"/>
       </w:tblPr>
       <w:tblGrid>
-        <w:gridCol w:w="1419"/>
-        <w:gridCol w:w="1419"/>
-        <w:gridCol w:w="1419"/>
-        <w:gridCol w:w="1419"/>
-        <w:gridCol w:w="1419"/>
-        <w:gridCol w:w="1419"/>
-        <w:gridCol w:w="1419"/>
+        <w:gridCol w:w="2484"/>
+        <w:gridCol w:w="2484"/>
+        <w:gridCol w:w="2484"/>
+        <w:gridCol w:w="2484"/>
       </w:tblGrid>
       <w:tr>
         <w:tc>
           <w:tcPr>
-            <w:tcW w:type="dxa" w:w="1419"/>
+            <w:tcW w:type="dxa" w:w="2484"/>
             <w:shd w:fill="2E7D32"/>
           </w:tcPr>
           <w:p>
@@ -3291,13 +3289,13 @@
                 <w:color w:val="FFFFFF"/>
                 <w:sz w:val="17"/>
               </w:rPr>
-              <w:t>Модель</w:t>
+              <w:t>Метрика качества</w:t>
             </w:r>
           </w:p>
         </w:tc>
         <w:tc>
           <w:tcPr>
-            <w:tcW w:type="dxa" w:w="1419"/>
+            <w:tcW w:type="dxa" w:w="2484"/>
             <w:shd w:fill="2E7D32"/>
           </w:tcPr>
           <w:p>
@@ -3310,13 +3308,13 @@
                 <w:color w:val="FFFFFF"/>
                 <w:sz w:val="17"/>
               </w:rPr>
-              <w:t>Пошаговый MAE</w:t>
+              <w:t>Значение вручную</w:t>
             </w:r>
           </w:p>
         </w:tc>
         <w:tc>
           <w:tcPr>
-            <w:tcW w:type="dxa" w:w="1419"/>
+            <w:tcW w:type="dxa" w:w="2484"/>
             <w:shd w:fill="2E7D32"/>
           </w:tcPr>
           <w:p>
@@ -3329,13 +3327,13 @@
                 <w:color w:val="FFFFFF"/>
                 <w:sz w:val="17"/>
               </w:rPr>
-              <w:t>Sklearn MAE</w:t>
+              <w:t>Значение sklearn</w:t>
             </w:r>
           </w:p>
         </w:tc>
         <w:tc>
           <w:tcPr>
-            <w:tcW w:type="dxa" w:w="1419"/>
+            <w:tcW w:type="dxa" w:w="2484"/>
             <w:shd w:fill="2E7D32"/>
           </w:tcPr>
           <w:p>
@@ -3348,64 +3346,7 @@
                 <w:color w:val="FFFFFF"/>
                 <w:sz w:val="17"/>
               </w:rPr>
-              <w:t>Пошаговый RMSE</w:t>
-            </w:r>
-          </w:p>
-        </w:tc>
-        <w:tc>
-          <w:tcPr>
-            <w:tcW w:type="dxa" w:w="1419"/>
-            <w:shd w:fill="2E7D32"/>
-          </w:tcPr>
-          <w:p>
-            <w:pPr>
-              <w:jc w:val="center"/>
-            </w:pPr>
-            <w:r>
-              <w:rPr>
-                <w:b/>
-                <w:color w:val="FFFFFF"/>
-                <w:sz w:val="17"/>
-              </w:rPr>
-              <w:t>Sklearn RMSE</w:t>
-            </w:r>
-          </w:p>
-        </w:tc>
-        <w:tc>
-          <w:tcPr>
-            <w:tcW w:type="dxa" w:w="1419"/>
-            <w:shd w:fill="2E7D32"/>
-          </w:tcPr>
-          <w:p>
-            <w:pPr>
-              <w:jc w:val="center"/>
-            </w:pPr>
-            <w:r>
-              <w:rPr>
-                <w:b/>
-                <w:color w:val="FFFFFF"/>
-                <w:sz w:val="17"/>
-              </w:rPr>
-              <w:t>Пошаговый R²</w:t>
-            </w:r>
-          </w:p>
-        </w:tc>
-        <w:tc>
-          <w:tcPr>
-            <w:tcW w:type="dxa" w:w="1419"/>
-            <w:shd w:fill="2E7D32"/>
-          </w:tcPr>
-          <w:p>
-            <w:pPr>
-              <w:jc w:val="center"/>
-            </w:pPr>
-            <w:r>
-              <w:rPr>
-                <w:b/>
-                <w:color w:val="FFFFFF"/>
-                <w:sz w:val="17"/>
-              </w:rPr>
-              <w:t>Sklearn R²</w:t>
+              <w:t>Разница Δ</w:t>
             </w:r>
           </w:p>
         </w:tc>
@@ -3413,235 +3354,7 @@
       <w:tr>
         <w:tc>
           <w:tcPr>
-            <w:tcW w:type="dxa" w:w="1419"/>
-          </w:tcPr>
-          <w:p>
-            <w:pPr>
-              <w:jc w:val="left"/>
-            </w:pPr>
-            <w:r>
-              <w:rPr>
-                <w:sz w:val="17"/>
-              </w:rPr>
-              <w:t>Ridge (Linear)</w:t>
-            </w:r>
-          </w:p>
-        </w:tc>
-        <w:tc>
-          <w:tcPr>
-            <w:tcW w:type="dxa" w:w="1419"/>
-          </w:tcPr>
-          <w:p>
-            <w:pPr>
-              <w:jc w:val="right"/>
-            </w:pPr>
-            <w:r>
-              <w:rPr>
-                <w:sz w:val="17"/>
-              </w:rPr>
-              <w:t>1 810 279.67</w:t>
-            </w:r>
-          </w:p>
-        </w:tc>
-        <w:tc>
-          <w:tcPr>
-            <w:tcW w:type="dxa" w:w="1419"/>
-          </w:tcPr>
-          <w:p>
-            <w:pPr>
-              <w:jc w:val="right"/>
-            </w:pPr>
-            <w:r>
-              <w:rPr>
-                <w:sz w:val="17"/>
-              </w:rPr>
-              <w:t>1 810 279.67</w:t>
-            </w:r>
-          </w:p>
-        </w:tc>
-        <w:tc>
-          <w:tcPr>
-            <w:tcW w:type="dxa" w:w="1419"/>
-          </w:tcPr>
-          <w:p>
-            <w:pPr>
-              <w:jc w:val="right"/>
-            </w:pPr>
-            <w:r>
-              <w:rPr>
-                <w:sz w:val="17"/>
-              </w:rPr>
-              <w:t>2 172 374.05</w:t>
-            </w:r>
-          </w:p>
-        </w:tc>
-        <w:tc>
-          <w:tcPr>
-            <w:tcW w:type="dxa" w:w="1419"/>
-          </w:tcPr>
-          <w:p>
-            <w:pPr>
-              <w:jc w:val="right"/>
-            </w:pPr>
-            <w:r>
-              <w:rPr>
-                <w:sz w:val="17"/>
-              </w:rPr>
-              <w:t>2 172 374.05</w:t>
-            </w:r>
-          </w:p>
-        </w:tc>
-        <w:tc>
-          <w:tcPr>
-            <w:tcW w:type="dxa" w:w="1419"/>
-          </w:tcPr>
-          <w:p>
-            <w:pPr>
-              <w:jc w:val="right"/>
-            </w:pPr>
-            <w:r>
-              <w:rPr>
-                <w:sz w:val="17"/>
-              </w:rPr>
-              <w:t>-11.1161</w:t>
-            </w:r>
-          </w:p>
-        </w:tc>
-        <w:tc>
-          <w:tcPr>
-            <w:tcW w:type="dxa" w:w="1419"/>
-          </w:tcPr>
-          <w:p>
-            <w:pPr>
-              <w:jc w:val="right"/>
-            </w:pPr>
-            <w:r>
-              <w:rPr>
-                <w:sz w:val="17"/>
-              </w:rPr>
-              <w:t>-11.1161</w:t>
-            </w:r>
-          </w:p>
-        </w:tc>
-      </w:tr>
-      <w:tr>
-        <w:tc>
-          <w:tcPr>
-            <w:tcW w:type="dxa" w:w="1419"/>
-          </w:tcPr>
-          <w:p>
-            <w:pPr>
-              <w:jc w:val="left"/>
-            </w:pPr>
-            <w:r>
-              <w:rPr>
-                <w:sz w:val="17"/>
-              </w:rPr>
-              <w:t>Decision Tree</w:t>
-            </w:r>
-          </w:p>
-        </w:tc>
-        <w:tc>
-          <w:tcPr>
-            <w:tcW w:type="dxa" w:w="1419"/>
-          </w:tcPr>
-          <w:p>
-            <w:pPr>
-              <w:jc w:val="right"/>
-            </w:pPr>
-            <w:r>
-              <w:rPr>
-                <w:sz w:val="17"/>
-              </w:rPr>
-              <w:t>476 631.32</w:t>
-            </w:r>
-          </w:p>
-        </w:tc>
-        <w:tc>
-          <w:tcPr>
-            <w:tcW w:type="dxa" w:w="1419"/>
-          </w:tcPr>
-          <w:p>
-            <w:pPr>
-              <w:jc w:val="right"/>
-            </w:pPr>
-            <w:r>
-              <w:rPr>
-                <w:sz w:val="17"/>
-              </w:rPr>
-              <w:t>476 631.32</w:t>
-            </w:r>
-          </w:p>
-        </w:tc>
-        <w:tc>
-          <w:tcPr>
-            <w:tcW w:type="dxa" w:w="1419"/>
-          </w:tcPr>
-          <w:p>
-            <w:pPr>
-              <w:jc w:val="right"/>
-            </w:pPr>
-            <w:r>
-              <w:rPr>
-                <w:sz w:val="17"/>
-              </w:rPr>
-              <w:t>807 194.57</w:t>
-            </w:r>
-          </w:p>
-        </w:tc>
-        <w:tc>
-          <w:tcPr>
-            <w:tcW w:type="dxa" w:w="1419"/>
-          </w:tcPr>
-          <w:p>
-            <w:pPr>
-              <w:jc w:val="right"/>
-            </w:pPr>
-            <w:r>
-              <w:rPr>
-                <w:sz w:val="17"/>
-              </w:rPr>
-              <w:t>807 194.57</w:t>
-            </w:r>
-          </w:p>
-        </w:tc>
-        <w:tc>
-          <w:tcPr>
-            <w:tcW w:type="dxa" w:w="1419"/>
-          </w:tcPr>
-          <w:p>
-            <w:pPr>
-              <w:jc w:val="right"/>
-            </w:pPr>
-            <w:r>
-              <w:rPr>
-                <w:sz w:val="17"/>
-              </w:rPr>
-              <w:t>-0.6728</w:t>
-            </w:r>
-          </w:p>
-        </w:tc>
-        <w:tc>
-          <w:tcPr>
-            <w:tcW w:type="dxa" w:w="1419"/>
-          </w:tcPr>
-          <w:p>
-            <w:pPr>
-              <w:jc w:val="right"/>
-            </w:pPr>
-            <w:r>
-              <w:rPr>
-                <w:sz w:val="17"/>
-              </w:rPr>
-              <w:t>-0.6728</w:t>
-            </w:r>
-          </w:p>
-        </w:tc>
-      </w:tr>
-      <w:tr>
-        <w:tc>
-          <w:tcPr>
-            <w:tcW w:type="dxa" w:w="1419"/>
+            <w:tcW w:type="dxa" w:w="2484"/>
           </w:tcPr>
           <w:p>
             <w:pPr>
@@ -3652,13 +3365,13 @@
                 <w:b/>
                 <w:sz w:val="17"/>
               </w:rPr>
-              <w:t>Random Forest (Лучшая)</w:t>
+              <w:t>MAE (средняя абсолютная ошибка)</w:t>
             </w:r>
           </w:p>
         </w:tc>
         <w:tc>
           <w:tcPr>
-            <w:tcW w:type="dxa" w:w="1419"/>
+            <w:tcW w:type="dxa" w:w="2484"/>
           </w:tcPr>
           <w:p>
             <w:pPr>
@@ -3669,13 +3382,13 @@
                 <w:b/>
                 <w:sz w:val="17"/>
               </w:rPr>
-              <w:t>393 747.05</w:t>
+              <w:t>393 747.05 TRY</w:t>
             </w:r>
           </w:p>
         </w:tc>
         <w:tc>
           <w:tcPr>
-            <w:tcW w:type="dxa" w:w="1419"/>
+            <w:tcW w:type="dxa" w:w="2484"/>
           </w:tcPr>
           <w:p>
             <w:pPr>
@@ -3686,13 +3399,13 @@
                 <w:b/>
                 <w:sz w:val="17"/>
               </w:rPr>
-              <w:t>393 747.05</w:t>
+              <w:t>393 747.05 TRY</w:t>
             </w:r>
           </w:p>
         </w:tc>
         <w:tc>
           <w:tcPr>
-            <w:tcW w:type="dxa" w:w="1419"/>
+            <w:tcW w:type="dxa" w:w="2484"/>
           </w:tcPr>
           <w:p>
             <w:pPr>
@@ -3703,13 +3416,32 @@
                 <w:b/>
                 <w:sz w:val="17"/>
               </w:rPr>
-              <w:t>577 294.57</w:t>
+              <w:t>0.00</w:t>
+            </w:r>
+          </w:p>
+        </w:tc>
+      </w:tr>
+      <w:tr>
+        <w:tc>
+          <w:tcPr>
+            <w:tcW w:type="dxa" w:w="2484"/>
+          </w:tcPr>
+          <w:p>
+            <w:pPr>
+              <w:jc w:val="left"/>
+            </w:pPr>
+            <w:r>
+              <w:rPr>
+                <w:b/>
+                <w:sz w:val="17"/>
+              </w:rPr>
+              <w:t>RMSE (среднеквадратичное отклонение)</w:t>
             </w:r>
           </w:p>
         </w:tc>
         <w:tc>
           <w:tcPr>
-            <w:tcW w:type="dxa" w:w="1419"/>
+            <w:tcW w:type="dxa" w:w="2484"/>
           </w:tcPr>
           <w:p>
             <w:pPr>
@@ -3720,13 +3452,66 @@
                 <w:b/>
                 <w:sz w:val="17"/>
               </w:rPr>
-              <w:t>577 294.57</w:t>
+              <w:t>577 294.57 TRY</w:t>
             </w:r>
           </w:p>
         </w:tc>
         <w:tc>
           <w:tcPr>
-            <w:tcW w:type="dxa" w:w="1419"/>
+            <w:tcW w:type="dxa" w:w="2484"/>
+          </w:tcPr>
+          <w:p>
+            <w:pPr>
+              <w:jc w:val="right"/>
+            </w:pPr>
+            <w:r>
+              <w:rPr>
+                <w:b/>
+                <w:sz w:val="17"/>
+              </w:rPr>
+              <w:t>577 294.57 TRY</w:t>
+            </w:r>
+          </w:p>
+        </w:tc>
+        <w:tc>
+          <w:tcPr>
+            <w:tcW w:type="dxa" w:w="2484"/>
+          </w:tcPr>
+          <w:p>
+            <w:pPr>
+              <w:jc w:val="right"/>
+            </w:pPr>
+            <w:r>
+              <w:rPr>
+                <w:b/>
+                <w:sz w:val="17"/>
+              </w:rPr>
+              <w:t>0.00</w:t>
+            </w:r>
+          </w:p>
+        </w:tc>
+      </w:tr>
+      <w:tr>
+        <w:tc>
+          <w:tcPr>
+            <w:tcW w:type="dxa" w:w="2484"/>
+          </w:tcPr>
+          <w:p>
+            <w:pPr>
+              <w:jc w:val="left"/>
+            </w:pPr>
+            <w:r>
+              <w:rPr>
+                <w:b/>
+                <w:sz w:val="17"/>
+              </w:rPr>
+              <w:t>R² (коэффициент согласованности)</w:t>
+            </w:r>
+          </w:p>
+        </w:tc>
+        <w:tc>
+          <w:tcPr>
+            <w:tcW w:type="dxa" w:w="2484"/>
           </w:tcPr>
           <w:p>
             <w:pPr>
@@ -3743,7 +3528,7 @@
         </w:tc>
         <w:tc>
           <w:tcPr>
-            <w:tcW w:type="dxa" w:w="1419"/>
+            <w:tcW w:type="dxa" w:w="2484"/>
           </w:tcPr>
           <w:p>
             <w:pPr>
@@ -3758,23 +3543,40 @@
             </w:r>
           </w:p>
         </w:tc>
+        <w:tc>
+          <w:tcPr>
+            <w:tcW w:type="dxa" w:w="2484"/>
+          </w:tcPr>
+          <w:p>
+            <w:pPr>
+              <w:jc w:val="right"/>
+            </w:pPr>
+            <w:r>
+              <w:rPr>
+                <w:b/>
+                <w:sz w:val="17"/>
+              </w:rPr>
+              <w:t>0.00</w:t>
+            </w:r>
+          </w:p>
+        </w:tc>
       </w:tr>
     </w:tbl>
     <w:p>
       <w:pPr>
-        <w:spacing w:before="160"/>
+        <w:spacing w:before="120"/>
       </w:pPr>
       <w:r>
         <w:rPr>
           <w:i/>
           <w:color w:val="15803D"/>
         </w:rPr>
-        <w:t>Подтверждение точности: По всем моделям расчет по шагам сошелся с библиотекой scikit-learn абсолютно точно (разница строго 0.00).</w:t>
+        <w:t>Вывод: Разница между пошаговым расчетом и библиотекой scikit-learn равна строго 0.00, что доказывает полную точность вычислений.</w:t>
       </w:r>
     </w:p>
     <w:p>
       <w:pPr>
-        <w:spacing w:before="160"/>
+        <w:spacing w:before="120"/>
       </w:pPr>
     </w:p>
     <w:p>
@@ -3822,7 +3624,7 @@
           <w:i/>
           <w:sz w:val="18"/>
         </w:rPr>
-        <w:t>Рис. 1. Графическая верификация совпадения расчетов с библиотекой scikit-learn</w:t>
+        <w:t>Рис. 1. Графическая верификация совпадения ручного расчета с библиотекой scikit-learn</w:t>
       </w:r>
     </w:p>
     <w:p>
@@ -3830,12 +3632,35 @@
         <w:pStyle w:val="Heading1"/>
       </w:pPr>
       <w:r>
-        <w:t>4. Сравнительный анализ с групповой работой через диаграммы</w:t>
+        <w:t>4. Провести анализ полученных результатов</w:t>
       </w:r>
     </w:p>
     <w:p>
       <w:r>
-        <w:t>Сравнение показателей моделей на большой выборке группового проекта и на 20 контрольных квартирах:</w:t>
+        <w:t>Анализ результатов на контрольной выборке и сопоставление с групповой работой:</w:t>
+        <w:br/>
+        <w:br/>
+      </w:r>
+      <w:r>
+        <w:rPr>
+          <w:b/>
+        </w:rPr>
+        <w:t xml:space="preserve">1. Анализ точности по типам жилья: </w:t>
+      </w:r>
+      <w:r>
+        <w:t>модель отлично прогнозирует цены на типовые квартиры (Daire) в городской черте (ошибки от 9 до 25%). На нестандартных объектах (курортные дачи Yazlık на побережье, кооперативы с площадью 1 м²) ошибки выше из-за территориальной специфики и опечаток в исходных объявлениях.</w:t>
+        <w:br/>
+        <w:br/>
+      </w:r>
+      <w:r>
+        <w:rPr>
+          <w:b/>
+        </w:rPr>
+        <w:t xml:space="preserve">2. Сопоставление с групповым проектом: </w:t>
+      </w:r>
+      <w:r>
+        <w:t>в таблице ниже приведено сравнение показателей качества модели на большой выборке группового проекта и на 20 контрольных объектах:</w:t>
+        <w:br/>
       </w:r>
     </w:p>
     <w:tbl>
@@ -4344,12 +4169,12 @@
         <w:pStyle w:val="Heading2"/>
       </w:pPr>
       <w:r>
-        <w:t>Анализ сравнительных графиков</w:t>
+        <w:t>Графический анализ результатов</w:t>
       </w:r>
     </w:p>
     <w:p>
       <w:pPr>
-        <w:spacing w:before="160"/>
+        <w:spacing w:before="120"/>
       </w:pPr>
     </w:p>
     <w:p>
@@ -4402,7 +4227,7 @@
     </w:p>
     <w:p>
       <w:pPr>
-        <w:spacing w:before="160"/>
+        <w:spacing w:before="120"/>
       </w:pPr>
     </w:p>
     <w:p>
@@ -4455,7 +4280,7 @@
     </w:p>
     <w:p>
       <w:pPr>
-        <w:spacing w:before="160"/>
+        <w:spacing w:before="120"/>
       </w:pPr>
     </w:p>
     <w:p>
@@ -4508,7 +4333,7 @@
     </w:p>
     <w:p>
       <w:pPr>
-        <w:spacing w:before="160"/>
+        <w:spacing w:before="120"/>
       </w:pPr>
     </w:p>
     <w:p>
@@ -4561,7 +4386,7 @@
     </w:p>
     <w:p>
       <w:pPr>
-        <w:spacing w:before="160"/>
+        <w:spacing w:before="120"/>
       </w:pPr>
     </w:p>
     <w:p>
@@ -4614,7 +4439,7 @@
     </w:p>
     <w:p>
       <w:pPr>
-        <w:spacing w:before="160"/>
+        <w:spacing w:before="120"/>
       </w:pPr>
     </w:p>
     <w:p>
@@ -4667,7 +4492,7 @@
     </w:p>
     <w:p>
       <w:pPr>
-        <w:spacing w:before="160"/>
+        <w:spacing w:before="120"/>
       </w:pPr>
     </w:p>
     <w:p>
@@ -4723,7 +4548,42 @@
         <w:pStyle w:val="Heading1"/>
       </w:pPr>
       <w:r>
-        <w:t>5. Итоговые выводы</w:t>
+        <w:t>5. Результат: отчет по выполненной работе и result_real_estate_samples.csv</w:t>
+      </w:r>
+    </w:p>
+    <w:p>
+      <w:r>
+        <w:t>В результате выполнения задания сформированы и подготовлены следующие материалы:</w:t>
+        <w:br/>
+        <w:br/>
+      </w:r>
+      <w:r>
+        <w:rPr>
+          <w:b/>
+        </w:rPr>
+        <w:t xml:space="preserve">• Файл с результатами: </w:t>
+      </w:r>
+      <w:r>
+        <w:t>result_real_estate_samples.csv со всеми исходными столбцами, добавленными колонками ФИО и Группа, и завершающим столбцом predicted_price (прогноз нашей модели).</w:t>
+        <w:br/>
+      </w:r>
+      <w:r>
+        <w:rPr>
+          <w:b/>
+        </w:rPr>
+        <w:t xml:space="preserve">• Документация и отчеты: </w:t>
+      </w:r>
+      <w:r>
+        <w:t>полный отчет в формате Word (SOLO_REPORT_REAL_ESTATE.docx), Markdown-отчет (SOLO_REPORT_REAL_ESTATE.md), исполняемый блокнот solo_evaluation.ipynb и расчетная таблица manual_calculation_breakdown.csv.</w:t>
+        <w:br/>
+        <w:br/>
+      </w:r>
+      <w:r>
+        <w:rPr>
+          <w:b/>
+        </w:rPr>
+        <w:t>Итоговые выводы простыми словами:</w:t>
+        <w:br/>
       </w:r>
     </w:p>
     <w:p>

</xml_diff>